<commit_message>
Add Diagram Class and Diagram use
</commit_message>
<xml_diff>
--- a/doc/Documento_Proyecto.docx
+++ b/doc/Documento_Proyecto.docx
@@ -34,19 +34,29 @@
             </w:rPr>
             <w:pict w14:anchorId="7F30CA84">
               <v:group id="Grupo 2" o:spid="_x0000_s1028" style="position:absolute;margin-left:130.95pt;margin-top:252.55pt;width:432.6pt;height:448.55pt;z-index:-503316478;mso-width-percent:710;mso-height-percent:570;mso-wrap-distance-left:0;mso-wrap-distance-right:0;mso-wrap-distance-bottom:.25pt;mso-position-horizontal-relative:page;mso-position-vertical-relative:page;mso-width-percent:710;mso-height-percent:570" coordsize="54939,56966" o:gfxdata="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" o:allowincell="f">
-                <v:shape id="Forma libre 64" o:spid="_x0000_s1029" style="position:absolute;left:19062;width:35877;height:35967;visibility:visible;mso-wrap-style:square;v-text-anchor:top" coordsize="1781,1786" o:gfxdata="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" path="m4,1786l,1782,1776,r5,5l4,1786xe" fillcolor="#2c7fce [1951]" stroked="f" strokeweight="0">
+                <v:shape id="Forma libre 64" o:spid="_x0000_s1029" style="position:absolute;left:19062;width:35877;height:35967;visibility:visible;mso-wrap-style:square;v-text-anchor:top" coordsize="1781,1786" o:spt="100" o:gfxdata="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" adj="0,,0" path="m4,1786l,1782,1776,r5,5l4,1786xe" fillcolor="#2c7fce [1951]" stroked="f" strokeweight="0">
+                  <v:stroke joinstyle="round"/>
+                  <v:formulas/>
                   <v:path arrowok="t" o:connecttype="custom" o:connectlocs="8058,3596760;0,3588705;3577688,0;3587760,10069;8058,3596760" o:connectangles="0,0,0,0,0" textboxrect="0,0,1781,1786"/>
                 </v:shape>
-                <v:shape id="Forma libre 65" o:spid="_x0000_s1030" style="position:absolute;left:9932;top:2876;width:45004;height:44982;visibility:visible;mso-wrap-style:square;v-text-anchor:top" coordsize="2234,2234" o:gfxdata="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" path="m5,2234l,2229,2229,r5,5l5,2234xe" fillcolor="#2c7fce [1951]" stroked="f" strokeweight="0">
+                <v:shape id="Forma libre 65" o:spid="_x0000_s1030" style="position:absolute;left:9932;top:2876;width:45004;height:44982;visibility:visible;mso-wrap-style:square;v-text-anchor:top" coordsize="2234,2234" o:spt="100" o:gfxdata="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" adj="0,,0" path="m5,2234l,2229,2229,r5,5l5,2234xe" fillcolor="#2c7fce [1951]" stroked="f" strokeweight="0">
+                  <v:stroke joinstyle="round"/>
+                  <v:formulas/>
                   <v:path arrowok="t" o:connecttype="custom" o:connectlocs="10072,4498200;0,4488132;4490288,0;4500360,10068;10072,4498200" o:connectangles="0,0,0,0,0" textboxrect="0,0,2234,2234"/>
                 </v:shape>
-                <v:shape id="Forma libre 66" o:spid="_x0000_s1031" style="position:absolute;left:10681;top:1389;width:44258;height:44241;visibility:visible;mso-wrap-style:square;v-text-anchor:top" coordsize="2197,2197" o:gfxdata="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" path="m9,2197l,2193,2188,r9,10l9,2197xe" fillcolor="#2c7fce [1951]" stroked="f" strokeweight="0">
+                <v:shape id="Forma libre 66" o:spid="_x0000_s1031" style="position:absolute;left:10681;top:1389;width:44258;height:44241;visibility:visible;mso-wrap-style:square;v-text-anchor:top" coordsize="2197,2197" o:spt="100" o:gfxdata="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" adj="0,,0" path="m9,2197l,2193,2188,r9,10l9,2197xe" fillcolor="#2c7fce [1951]" stroked="f" strokeweight="0">
+                  <v:stroke joinstyle="round"/>
+                  <v:formulas/>
                   <v:path arrowok="t" o:connecttype="custom" o:connectlocs="18130,4424040;0,4415985;4407710,0;4425840,20137;18130,4424040" o:connectangles="0,0,0,0,0" textboxrect="0,0,2197,2197"/>
                 </v:shape>
-                <v:shape id="Forma libre 67" o:spid="_x0000_s1032" style="position:absolute;left:15436;top:6325;width:39503;height:39585;visibility:visible;mso-wrap-style:square;v-text-anchor:top" coordsize="1961,1966" o:gfxdata="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" path="m9,1966l,1957,1952,r9,9l9,1966xe" fillcolor="#2c7fce [1951]" stroked="f" strokeweight="0">
+                <v:shape id="Forma libre 67" o:spid="_x0000_s1032" style="position:absolute;left:15436;top:6325;width:39503;height:39585;visibility:visible;mso-wrap-style:square;v-text-anchor:top" coordsize="1961,1966" o:spt="100" o:gfxdata="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" adj="0,,0" path="m9,1966l,1957,1952,r9,9l9,1966xe" fillcolor="#2c7fce [1951]" stroked="f" strokeweight="0">
+                  <v:stroke joinstyle="round"/>
+                  <v:formulas/>
                   <v:path arrowok="t" o:connecttype="custom" o:connectlocs="18130,3958560;0,3940438;3932150,0;3950280,18122;18130,3958560" o:connectangles="0,0,0,0,0" textboxrect="0,0,1961,1966"/>
                 </v:shape>
-                <v:shape id="Forma libre 68" o:spid="_x0000_s1033" style="position:absolute;top:1951;width:54939;height:55015;visibility:visible;mso-wrap-style:square;v-text-anchor:top" coordsize="2727,2732" o:gfxdata="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" path="m,2732r,-4l2722,r5,5l,2732xe" fillcolor="#2c7fce [1951]" stroked="f" strokeweight="0">
+                <v:shape id="Forma libre 68" o:spid="_x0000_s1033" style="position:absolute;top:1951;width:54939;height:55015;visibility:visible;mso-wrap-style:square;v-text-anchor:top" coordsize="2727,2732" o:spt="100" o:gfxdata="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" adj="0,,0" path="m,2732r,-4l2722,r5,5l,2732xe" fillcolor="#2c7fce [1951]" stroked="f" strokeweight="0">
+                  <v:stroke joinstyle="round"/>
+                  <v:formulas/>
                   <v:path arrowok="t" o:connecttype="custom" o:connectlocs="0,5501520;0,5493465;5483887,0;5493960,10069;0,5501520" o:connectangles="0,0,0,0,0" textboxrect="0,0,2727,2732"/>
                 </v:shape>
                 <w10:wrap anchorx="page" anchory="page"/>
@@ -2048,18 +2058,10 @@
           <w:noProof/>
         </w:rPr>
         <w:drawing>
-          <wp:anchor distT="0" distB="0" distL="0" distR="0" simplePos="0" relativeHeight="8" behindDoc="0" locked="0" layoutInCell="0" allowOverlap="1" wp14:anchorId="45562FA3" wp14:editId="166E56C3">
-            <wp:simplePos x="0" y="0"/>
-            <wp:positionH relativeFrom="column">
-              <wp:posOffset>-576580</wp:posOffset>
-            </wp:positionH>
-            <wp:positionV relativeFrom="paragraph">
-              <wp:posOffset>121920</wp:posOffset>
-            </wp:positionV>
-            <wp:extent cx="6979920" cy="4452620"/>
+          <wp:inline distT="0" distB="0" distL="0" distR="0" wp14:anchorId="1618BF55" wp14:editId="2504AE26">
+            <wp:extent cx="5394960" cy="4484370"/>
             <wp:effectExtent l="0" t="0" r="0" b="0"/>
-            <wp:wrapSquare wrapText="largest"/>
-            <wp:docPr id="9" name="Imagen1"/>
+            <wp:docPr id="1587348578" name="Imagen 2"/>
             <wp:cNvGraphicFramePr>
               <a:graphicFrameLocks xmlns:a="http://schemas.openxmlformats.org/drawingml/2006/main" noChangeAspect="1"/>
             </wp:cNvGraphicFramePr>
@@ -2067,13 +2069,20 @@
               <a:graphicData uri="http://schemas.openxmlformats.org/drawingml/2006/picture">
                 <pic:pic xmlns:pic="http://schemas.openxmlformats.org/drawingml/2006/picture">
                   <pic:nvPicPr>
-                    <pic:cNvPr id="9" name="Imagen1"/>
+                    <pic:cNvPr id="0" name="Picture 2"/>
                     <pic:cNvPicPr>
                       <a:picLocks noChangeAspect="1" noChangeArrowheads="1"/>
                     </pic:cNvPicPr>
                   </pic:nvPicPr>
                   <pic:blipFill>
-                    <a:blip r:embed="rId7"/>
+                    <a:blip r:embed="rId7">
+                      <a:extLst>
+                        <a:ext uri="{28A0092B-C50C-407E-A947-70E740481C1C}">
+                          <a14:useLocalDpi xmlns:a14="http://schemas.microsoft.com/office/drawing/2010/main" val="0"/>
+                        </a:ext>
+                      </a:extLst>
+                    </a:blip>
+                    <a:srcRect/>
                     <a:stretch>
                       <a:fillRect/>
                     </a:stretch>
@@ -2081,88 +2090,94 @@
                   <pic:spPr bwMode="auto">
                     <a:xfrm>
                       <a:off x="0" y="0"/>
-                      <a:ext cx="6979920" cy="4452620"/>
+                      <a:ext cx="5394960" cy="4484370"/>
                     </a:xfrm>
                     <a:prstGeom prst="rect">
                       <a:avLst/>
                     </a:prstGeom>
                     <a:noFill/>
+                    <a:ln>
+                      <a:noFill/>
+                    </a:ln>
                   </pic:spPr>
                 </pic:pic>
               </a:graphicData>
             </a:graphic>
-          </wp:anchor>
+          </wp:inline>
         </w:drawing>
       </w:r>
     </w:p>
-    <w:p>
-      <w:pPr>
-        <w:jc w:val="center"/>
-      </w:pPr>
-    </w:p>
-    <w:p>
-      <w:pPr>
-        <w:jc w:val="center"/>
-      </w:pPr>
-    </w:p>
-    <w:p>
-      <w:pPr>
-        <w:jc w:val="center"/>
-      </w:pPr>
-    </w:p>
-    <w:p>
-      <w:pPr>
-        <w:jc w:val="center"/>
-      </w:pPr>
-    </w:p>
-    <w:p>
-      <w:pPr>
-        <w:jc w:val="center"/>
-      </w:pPr>
-    </w:p>
-    <w:p>
-      <w:pPr>
-        <w:jc w:val="center"/>
-      </w:pPr>
-    </w:p>
-    <w:p>
-      <w:pPr>
-        <w:jc w:val="center"/>
-      </w:pPr>
-    </w:p>
-    <w:p>
-      <w:pPr>
-        <w:jc w:val="center"/>
-      </w:pPr>
-    </w:p>
-    <w:p>
-      <w:pPr>
-        <w:jc w:val="center"/>
-      </w:pPr>
-    </w:p>
-    <w:p>
-      <w:pPr>
-        <w:jc w:val="center"/>
-      </w:pPr>
-    </w:p>
-    <w:p>
-      <w:pPr>
-        <w:jc w:val="center"/>
-      </w:pPr>
-    </w:p>
+    <w:p/>
     <w:p>
       <w:pPr>
         <w:pStyle w:val="Ttulo2"/>
       </w:pPr>
       <w:r>
+        <w:lastRenderedPageBreak/>
         <w:t>4.- Class diagram</w:t>
       </w:r>
     </w:p>
     <w:p>
+      <w:r>
+        <w:rPr>
+          <w:noProof/>
+        </w:rPr>
+        <w:drawing>
+          <wp:inline distT="0" distB="0" distL="0" distR="0" wp14:anchorId="256EEA04" wp14:editId="058D4C50">
+            <wp:extent cx="5391150" cy="5048885"/>
+            <wp:effectExtent l="0" t="0" r="0" b="0"/>
+            <wp:docPr id="82568476" name="Imagen 1"/>
+            <wp:cNvGraphicFramePr>
+              <a:graphicFrameLocks xmlns:a="http://schemas.openxmlformats.org/drawingml/2006/main" noChangeAspect="1"/>
+            </wp:cNvGraphicFramePr>
+            <a:graphic xmlns:a="http://schemas.openxmlformats.org/drawingml/2006/main">
+              <a:graphicData uri="http://schemas.openxmlformats.org/drawingml/2006/picture">
+                <pic:pic xmlns:pic="http://schemas.openxmlformats.org/drawingml/2006/picture">
+                  <pic:nvPicPr>
+                    <pic:cNvPr id="0" name="Picture 1"/>
+                    <pic:cNvPicPr>
+                      <a:picLocks noChangeAspect="1" noChangeArrowheads="1"/>
+                    </pic:cNvPicPr>
+                  </pic:nvPicPr>
+                  <pic:blipFill>
+                    <a:blip r:embed="rId8" cstate="print">
+                      <a:extLst>
+                        <a:ext uri="{28A0092B-C50C-407E-A947-70E740481C1C}">
+                          <a14:useLocalDpi xmlns:a14="http://schemas.microsoft.com/office/drawing/2010/main" val="0"/>
+                        </a:ext>
+                      </a:extLst>
+                    </a:blip>
+                    <a:srcRect/>
+                    <a:stretch>
+                      <a:fillRect/>
+                    </a:stretch>
+                  </pic:blipFill>
+                  <pic:spPr bwMode="auto">
+                    <a:xfrm>
+                      <a:off x="0" y="0"/>
+                      <a:ext cx="5391150" cy="5048885"/>
+                    </a:xfrm>
+                    <a:prstGeom prst="rect">
+                      <a:avLst/>
+                    </a:prstGeom>
+                    <a:noFill/>
+                    <a:ln>
+                      <a:noFill/>
+                    </a:ln>
+                  </pic:spPr>
+                </pic:pic>
+              </a:graphicData>
+            </a:graphic>
+          </wp:inline>
+        </w:drawing>
+      </w:r>
+    </w:p>
+    <w:p>
       <w:pPr>
         <w:pStyle w:val="Ttulo2"/>
       </w:pPr>
       <w:r>
+        <w:lastRenderedPageBreak/>
         <w:t>5.- Screen / UI Design</w:t>
       </w:r>
     </w:p>
@@ -2189,7 +2204,7 @@
                     </pic:cNvPicPr>
                   </pic:nvPicPr>
                   <pic:blipFill>
-                    <a:blip r:embed="rId8"/>
+                    <a:blip r:embed="rId9"/>
                     <a:stretch>
                       <a:fillRect/>
                     </a:stretch>
@@ -3917,6 +3932,10 @@
 </file>
 
 <file path=customXml/item1.xml><?xml version="1.0" encoding="utf-8"?>
+<b:Sources xmlns:b="http://schemas.openxmlformats.org/officeDocument/2006/bibliography" xmlns="http://schemas.openxmlformats.org/officeDocument/2006/bibliography" SelectedStyle="\APASixthEditionOfficeOnline.xsl" StyleName="APA" Version="6"/>
+</file>
+
+<file path=customXml/item2.xml><?xml version="1.0" encoding="utf-8"?>
 <CoverPageProperties xmlns="http://schemas.microsoft.com/office/2006/coverPageProps">
   <PublishDate>2026</PublishDate>
   <Abstract/>
@@ -3927,22 +3946,18 @@
 </CoverPageProperties>
 </file>
 
-<file path=customXml/item2.xml><?xml version="1.0" encoding="utf-8"?>
-<b:Sources xmlns:b="http://schemas.openxmlformats.org/officeDocument/2006/bibliography" xmlns="http://schemas.openxmlformats.org/officeDocument/2006/bibliography" SelectedStyle="\APASixthEditionOfficeOnline.xsl" StyleName="APA" Version="6"/>
+<file path=customXml/itemProps1.xml><?xml version="1.0" encoding="utf-8"?>
+<ds:datastoreItem xmlns:ds="http://schemas.openxmlformats.org/officeDocument/2006/customXml" ds:itemID="{46F59AA6-DC04-4813-B1A7-2FE6B15873D2}">
+  <ds:schemaRefs>
+    <ds:schemaRef ds:uri="http://schemas.openxmlformats.org/officeDocument/2006/bibliography"/>
+  </ds:schemaRefs>
+</ds:datastoreItem>
 </file>
 
-<file path=customXml/itemProps1.xml><?xml version="1.0" encoding="utf-8"?>
+<file path=customXml/itemProps2.xml><?xml version="1.0" encoding="utf-8"?>
 <ds:datastoreItem xmlns:ds="http://schemas.openxmlformats.org/officeDocument/2006/customXml" ds:itemID="{EA9E0C3C-D88A-4A7D-BADA-D87E5D1758D8}">
   <ds:schemaRefs>
     <ds:schemaRef ds:uri="http://schemas.microsoft.com/office/2006/coverPageProps"/>
   </ds:schemaRefs>
 </ds:datastoreItem>
-</file>
-
-<file path=customXml/itemProps2.xml><?xml version="1.0" encoding="utf-8"?>
-<ds:datastoreItem xmlns:ds="http://schemas.openxmlformats.org/officeDocument/2006/customXml" ds:itemID="{46F59AA6-DC04-4813-B1A7-2FE6B15873D2}">
-  <ds:schemaRefs>
-    <ds:schemaRef ds:uri="http://schemas.openxmlformats.org/officeDocument/2006/bibliography"/>
-  </ds:schemaRefs>
-</ds:datastoreItem>
 </file>
</xml_diff>